<commit_message>
chore: re-verify references pages with placeholder email domains
Co-Authored-By: Claude Opus 5.5 <noreply@anthropic.com>
Claude-Session: https://claude.ai/code/session_018Hh9hVBWfKtt47QQkPMoFc
</commit_message>
<xml_diff>
--- a/fixtures/classic/classic-references-a4.docx
+++ b/fixtures/classic/classic-references-a4.docx
@@ -128,7 +128,7 @@
           <w:rPr>
             <w:rtl w:val="0"/>
           </w:rPr>
-          <w:t xml:space="preserve">jprice@ridgewaycap.com</w:t>
+          <w:t xml:space="preserve">jprice@example.com</w:t>
         </w:r>
       </w:hyperlink>
       <w:r>
@@ -215,7 +215,7 @@
           <w:rPr>
             <w:rtl w:val="0"/>
           </w:rPr>
-          <w:t xml:space="preserve">gliu@halden.edu</w:t>
+          <w:t xml:space="preserve">gliu@example.org</w:t>
         </w:r>
       </w:hyperlink>
       <w:r>
@@ -302,7 +302,7 @@
           <w:rPr>
             <w:rtl w:val="0"/>
           </w:rPr>
-          <w:t xml:space="preserve">sortiz@halden.edu</w:t>
+          <w:t xml:space="preserve">sortiz@example.org</w:t>
         </w:r>
       </w:hyperlink>
       <w:r>

</xml_diff>